<commit_message>
site: trying to make site present better overall - amazonboycott is still fine. added other paths (about, infra, proj, tools)
</commit_message>
<xml_diff>
--- a/site/writing/guides/amazonBoycott.docx
+++ b/site/writing/guides/amazonBoycott.docx
@@ -49,6 +49,7 @@
           <w:bCs/>
         </w:rPr>
       </w:pPr>
+      <w:proofErr w:type="spellStart"/>
       <w:r>
         <w:rPr>
           <w:b/>
@@ -56,6 +57,14 @@
         </w:rPr>
         <w:t>Summary</w:t>
       </w:r>
+      <w:r>
+        <w:rPr>
+          <w:b/>
+          <w:bCs/>
+        </w:rPr>
+        <w:t>x</w:t>
+      </w:r>
+      <w:proofErr w:type="spellEnd"/>
     </w:p>
     <w:p>
       <w:r>

</xml_diff>